<commit_message>
Minor changes to documents.
</commit_message>
<xml_diff>
--- a/Key Documents/Word Doc Versions/TfL_What-If_Simulation_Test_Documents.docx
+++ b/Key Documents/Word Doc Versions/TfL_What-If_Simulation_Test_Documents.docx
@@ -85,7 +85,31 @@
           <w:lang w:eastAsia="en-GB"/>
           <w14:ligatures w14:val="none"/>
         </w:rPr>
-        <w:t>Project Name: Tfl-What-If-Simulation</w:t>
+        <w:t xml:space="preserve">Project Name: </w:t>
+      </w:r>
+      <w:proofErr w:type="spellStart"/>
+      <w:r>
+        <w:rPr>
+          <w:rFonts w:ascii="Helvetica" w:eastAsia="Times New Roman" w:hAnsi="Helvetica" w:cs="Times New Roman"/>
+          <w:kern w:val="0"/>
+          <w:sz w:val="21"/>
+          <w:szCs w:val="21"/>
+          <w:lang w:eastAsia="en-GB"/>
+          <w14:ligatures w14:val="none"/>
+        </w:rPr>
+        <w:t>Tfl</w:t>
+      </w:r>
+      <w:proofErr w:type="spellEnd"/>
+      <w:r>
+        <w:rPr>
+          <w:rFonts w:ascii="Helvetica" w:eastAsia="Times New Roman" w:hAnsi="Helvetica" w:cs="Times New Roman"/>
+          <w:kern w:val="0"/>
+          <w:sz w:val="21"/>
+          <w:szCs w:val="21"/>
+          <w:lang w:eastAsia="en-GB"/>
+          <w14:ligatures w14:val="none"/>
+        </w:rPr>
+        <w:t>-What-If-Simulation</w:t>
       </w:r>
     </w:p>
     <w:p>
@@ -294,7 +318,31 @@
           <w:lang w:eastAsia="en-GB"/>
           <w14:ligatures w14:val="none"/>
         </w:rPr>
-        <w:t>This document outlines the testing strategy, testing processes, implemented tests and planned testing activities for the project. The purpose of this document is to ensure the reliability, correctness, and stability of the system throughout development.</w:t>
+        <w:t>This document outlines the testing strategy, testing processes, implemented tests and planned testing activities for the project. The purpose of this document is to ensure the reliability, correctnes</w:t>
+      </w:r>
+      <w:r>
+        <w:rPr>
+          <w:rFonts w:ascii="Helvetica" w:eastAsia="Times New Roman" w:hAnsi="Helvetica" w:cs="Times New Roman"/>
+          <w:color w:val="000000"/>
+          <w:kern w:val="0"/>
+          <w:sz w:val="21"/>
+          <w:szCs w:val="21"/>
+          <w:lang w:eastAsia="en-GB"/>
+          <w14:ligatures w14:val="none"/>
+        </w:rPr>
+        <w:t xml:space="preserve">s and </w:t>
+      </w:r>
+      <w:r>
+        <w:rPr>
+          <w:rFonts w:ascii="Helvetica" w:eastAsia="Times New Roman" w:hAnsi="Helvetica" w:cs="Times New Roman"/>
+          <w:color w:val="000000"/>
+          <w:kern w:val="0"/>
+          <w:sz w:val="21"/>
+          <w:szCs w:val="21"/>
+          <w:lang w:eastAsia="en-GB"/>
+          <w14:ligatures w14:val="none"/>
+        </w:rPr>
+        <w:t>stability of the system throughout development.</w:t>
       </w:r>
     </w:p>
     <w:p>
@@ -352,7 +400,31 @@
           <w:lang w:eastAsia="en-GB"/>
           <w14:ligatures w14:val="none"/>
         </w:rPr>
-        <w:t>This testing document applies to all implemented project features derived from approved user stories, including graph construction, pathfinding functionality, database validation, frontend interactions, and backend communication.</w:t>
+        <w:t>This testing document applies to all implemented project features derived from approved user stories, including graph construction, pathfinding functionality, database validation, frontend interactions</w:t>
+      </w:r>
+      <w:r>
+        <w:rPr>
+          <w:rFonts w:ascii="Helvetica" w:eastAsia="Times New Roman" w:hAnsi="Helvetica" w:cs="Times New Roman"/>
+          <w:color w:val="000000"/>
+          <w:kern w:val="0"/>
+          <w:sz w:val="21"/>
+          <w:szCs w:val="21"/>
+          <w:lang w:eastAsia="en-GB"/>
+          <w14:ligatures w14:val="none"/>
+        </w:rPr>
+        <w:t xml:space="preserve"> </w:t>
+      </w:r>
+      <w:r>
+        <w:rPr>
+          <w:rFonts w:ascii="Helvetica" w:eastAsia="Times New Roman" w:hAnsi="Helvetica" w:cs="Times New Roman"/>
+          <w:color w:val="000000"/>
+          <w:kern w:val="0"/>
+          <w:sz w:val="21"/>
+          <w:szCs w:val="21"/>
+          <w:lang w:eastAsia="en-GB"/>
+          <w14:ligatures w14:val="none"/>
+        </w:rPr>
+        <w:t>and backend communication.</w:t>
       </w:r>
     </w:p>
     <w:p>
@@ -838,17 +910,17 @@
     <w:tbl>
       <w:tblPr>
         <w:tblStyle w:val="TableGrid"/>
-        <w:tblW w:w="0" w:type="auto"/>
+        <w:tblW w:w="9918" w:type="dxa"/>
         <w:tblLook w:val="04A0" w:firstRow="1" w:lastRow="0" w:firstColumn="1" w:lastColumn="0" w:noHBand="0" w:noVBand="1"/>
       </w:tblPr>
       <w:tblGrid>
-        <w:gridCol w:w="2427"/>
-        <w:gridCol w:w="6589"/>
+        <w:gridCol w:w="2689"/>
+        <w:gridCol w:w="7229"/>
       </w:tblGrid>
       <w:tr>
         <w:tc>
           <w:tcPr>
-            <w:tcW w:w="0" w:type="auto"/>
+            <w:tcW w:w="2689" w:type="dxa"/>
             <w:hideMark/>
           </w:tcPr>
           <w:p>
@@ -884,7 +956,7 @@
         </w:tc>
         <w:tc>
           <w:tcPr>
-            <w:tcW w:w="0" w:type="auto"/>
+            <w:tcW w:w="7229" w:type="dxa"/>
             <w:hideMark/>
           </w:tcPr>
           <w:p>
@@ -922,7 +994,7 @@
       <w:tr>
         <w:tc>
           <w:tcPr>
-            <w:tcW w:w="0" w:type="auto"/>
+            <w:tcW w:w="2689" w:type="dxa"/>
             <w:hideMark/>
           </w:tcPr>
           <w:p>
@@ -953,7 +1025,7 @@
         </w:tc>
         <w:tc>
           <w:tcPr>
-            <w:tcW w:w="0" w:type="auto"/>
+            <w:tcW w:w="7229" w:type="dxa"/>
             <w:hideMark/>
           </w:tcPr>
           <w:p>
@@ -998,7 +1070,7 @@
       <w:tr>
         <w:tc>
           <w:tcPr>
-            <w:tcW w:w="0" w:type="auto"/>
+            <w:tcW w:w="2689" w:type="dxa"/>
             <w:hideMark/>
           </w:tcPr>
           <w:p>
@@ -1029,7 +1101,7 @@
         </w:tc>
         <w:tc>
           <w:tcPr>
-            <w:tcW w:w="0" w:type="auto"/>
+            <w:tcW w:w="7229" w:type="dxa"/>
             <w:hideMark/>
           </w:tcPr>
           <w:p>
@@ -1074,7 +1146,7 @@
       <w:tr>
         <w:tc>
           <w:tcPr>
-            <w:tcW w:w="0" w:type="auto"/>
+            <w:tcW w:w="2689" w:type="dxa"/>
             <w:hideMark/>
           </w:tcPr>
           <w:p>
@@ -1105,7 +1177,7 @@
         </w:tc>
         <w:tc>
           <w:tcPr>
-            <w:tcW w:w="0" w:type="auto"/>
+            <w:tcW w:w="7229" w:type="dxa"/>
             <w:hideMark/>
           </w:tcPr>
           <w:p>
@@ -1150,7 +1222,7 @@
       <w:tr>
         <w:tc>
           <w:tcPr>
-            <w:tcW w:w="0" w:type="auto"/>
+            <w:tcW w:w="2689" w:type="dxa"/>
             <w:hideMark/>
           </w:tcPr>
           <w:p>
@@ -1181,7 +1253,7 @@
         </w:tc>
         <w:tc>
           <w:tcPr>
-            <w:tcW w:w="0" w:type="auto"/>
+            <w:tcW w:w="7229" w:type="dxa"/>
             <w:hideMark/>
           </w:tcPr>
           <w:p>
@@ -3927,7 +3999,7 @@
       </w:tblPr>
       <w:tblGrid>
         <w:gridCol w:w="2866"/>
-        <w:gridCol w:w="6123"/>
+        <w:gridCol w:w="6065"/>
       </w:tblGrid>
       <w:tr>
         <w:tc>
@@ -4062,7 +4134,31 @@
                 <w:lang w:eastAsia="en-GB"/>
                 <w14:ligatures w14:val="none"/>
               </w:rPr>
-              <w:t>Oversees testing activities, test planning, and quality assurance</w:t>
+              <w:t>Oversees testing activities, test planning</w:t>
+            </w:r>
+            <w:r>
+              <w:rPr>
+                <w:rFonts w:ascii="Helvetica" w:eastAsia="Times New Roman" w:hAnsi="Helvetica" w:cs="Times New Roman"/>
+                <w:color w:val="000000"/>
+                <w:kern w:val="0"/>
+                <w:sz w:val="21"/>
+                <w:szCs w:val="21"/>
+                <w:lang w:eastAsia="en-GB"/>
+                <w14:ligatures w14:val="none"/>
+              </w:rPr>
+              <w:t xml:space="preserve"> a</w:t>
+            </w:r>
+            <w:r>
+              <w:rPr>
+                <w:rFonts w:ascii="Helvetica" w:eastAsia="Times New Roman" w:hAnsi="Helvetica" w:cs="Times New Roman"/>
+                <w:color w:val="000000"/>
+                <w:kern w:val="0"/>
+                <w:sz w:val="21"/>
+                <w:szCs w:val="21"/>
+                <w:lang w:eastAsia="en-GB"/>
+                <w14:ligatures w14:val="none"/>
+              </w:rPr>
+              <w:t>nd quality assurance</w:t>
             </w:r>
           </w:p>
         </w:tc>
@@ -4190,7 +4286,7 @@
                 <w:lang w:eastAsia="en-GB"/>
                 <w14:ligatures w14:val="none"/>
               </w:rPr>
-              <w:t>Coordinates tasks, timelines, and project progress</w:t>
+              <w:t>Coordinates tasks, timelines and project progress</w:t>
             </w:r>
           </w:p>
         </w:tc>
@@ -4254,7 +4350,31 @@
                 <w:lang w:eastAsia="en-GB"/>
                 <w14:ligatures w14:val="none"/>
               </w:rPr>
-              <w:t>Maintains document structure, consistency, and version control</w:t>
+              <w:t>Maintains document structure, consistency</w:t>
+            </w:r>
+            <w:r>
+              <w:rPr>
+                <w:rFonts w:ascii="Helvetica" w:eastAsia="Times New Roman" w:hAnsi="Helvetica" w:cs="Times New Roman"/>
+                <w:color w:val="000000"/>
+                <w:kern w:val="0"/>
+                <w:sz w:val="21"/>
+                <w:szCs w:val="21"/>
+                <w:lang w:eastAsia="en-GB"/>
+                <w14:ligatures w14:val="none"/>
+              </w:rPr>
+              <w:t xml:space="preserve"> a</w:t>
+            </w:r>
+            <w:r>
+              <w:rPr>
+                <w:rFonts w:ascii="Helvetica" w:eastAsia="Times New Roman" w:hAnsi="Helvetica" w:cs="Times New Roman"/>
+                <w:color w:val="000000"/>
+                <w:kern w:val="0"/>
+                <w:sz w:val="21"/>
+                <w:szCs w:val="21"/>
+                <w:lang w:eastAsia="en-GB"/>
+                <w14:ligatures w14:val="none"/>
+              </w:rPr>
+              <w:t>nd version control</w:t>
             </w:r>
           </w:p>
         </w:tc>

</xml_diff>